<commit_message>
Finish Task04 Pass Submission
</commit_message>
<xml_diff>
--- a/Laboratory/Task03 - SQL and Schemas/TO3C-2.docx
+++ b/Laboratory/Task03 - SQL and Schemas/TO3C-2.docx
@@ -242,7 +242,7 @@
           <w:szCs w:val="28"/>
           <w:lang w:val="en-US"/>
         </w:rPr>
-        <w:t>umber (VietNam/Australia)</w:t>
+        <w:t xml:space="preserve">umber (Vietnam/Australia)</w:t>
       </w:r>
       <w:r>
         <w:rPr>
@@ -350,7 +350,7 @@
           <w:sz w:val="22"/>
           <w:szCs w:val="22"/>
         </w:rPr>
-        <w:t>he first task of the third laboratory in the Credit section requires students to complete the following description:</w:t>
+        <w:t xml:space="preserve">he first task of the third laboratory in the Credit section requires students to write a query that meets the following requirements:</w:t>
       </w:r>
     </w:p>
     <w:p>
@@ -387,7 +387,7 @@
           <w:szCs w:val="22"/>
           <w:lang w:val="en-US" w:eastAsia="zh-CN" w:bidi="ar"/>
         </w:rPr>
-        <w:t xml:space="preserve">For each row in the MOVIE table, display the stuid, Movieno,title, release year, ratingcode,runtime, the matching </w:t>
+        <w:t xml:space="preserve">For each row in the MOVIE table, display the stuid, Movieno, title, release year, ratingcode, runtime, the matching </w:t>
       </w:r>
       <w:r>
         <w:rPr>
@@ -427,6 +427,19 @@
           <w:lang w:val="en-US" w:eastAsia="zh-CN" w:bidi="ar"/>
         </w:rPr>
         <w:t xml:space="preserve">colour name </w:t>
+      </w:r>
+      <w:r>
+        <w:rPr>
+          <w:rFonts w:hint="default" w:ascii="Times New Roman" w:hAnsi="Times New Roman" w:eastAsia="SimSun" w:cs="Times New Roman"/>
+          <w:b w:val="0"/>
+          <w:bCs w:val="0"/>
+          <w:color w:val="000000"/>
+          <w:kern w:val="0"/>
+          <w:sz w:val="22"/>
+          <w:szCs w:val="22"/>
+          <w:lang w:val="en-US" w:eastAsia="zh-CN" w:bidi="ar"/>
+        </w:rPr>
+        <w:t xml:space="preserve">from the COLOURTYPE table. </w:t>
       </w:r>
     </w:p>
     <w:p>
@@ -463,44 +476,7 @@
           <w:szCs w:val="22"/>
           <w:lang w:val="en-US" w:eastAsia="zh-CN" w:bidi="ar"/>
         </w:rPr>
-        <w:t xml:space="preserve">from the COLOURTYPE table. </w:t>
-      </w:r>
-    </w:p>
-    <w:p>
-      <w:pPr>
-        <w:keepNext w:val="0"/>
-        <w:keepLines w:val="0"/>
-        <w:widowControl/>
-        <w:numPr>
-          <w:ilvl w:val="0"/>
-          <w:numId w:val="2"/>
-        </w:numPr>
-        <w:suppressLineNumbers w:val="0"/>
-        <w:tabs>
-          <w:tab w:val="clear" w:pos="420"/>
-        </w:tabs>
-        <w:ind w:left="880" w:leftChars="0" w:hanging="420" w:firstLineChars="0"/>
-        <w:jc w:val="both"/>
-        <w:rPr>
-          <w:rFonts w:hint="default" w:ascii="Times New Roman" w:hAnsi="Times New Roman" w:cs="Times New Roman"/>
-          <w:b w:val="0"/>
-          <w:bCs w:val="0"/>
-          <w:sz w:val="22"/>
-          <w:szCs w:val="22"/>
-        </w:rPr>
-      </w:pPr>
-      <w:r>
-        <w:rPr>
-          <w:rFonts w:hint="default" w:ascii="Times New Roman" w:hAnsi="Times New Roman" w:eastAsia="SimSun" w:cs="Times New Roman"/>
-          <w:b w:val="0"/>
-          <w:bCs w:val="0"/>
-          <w:color w:val="000000"/>
-          <w:kern w:val="0"/>
-          <w:sz w:val="22"/>
-          <w:szCs w:val="22"/>
-          <w:lang w:val="en-US" w:eastAsia="zh-CN" w:bidi="ar"/>
-        </w:rPr>
-        <w:t xml:space="preserve">Only display rows that have runtime of greater than 170 minutes </w:t>
+        <w:t xml:space="preserve">Only display rows that have runtime of greater than 170 minutes .</w:t>
       </w:r>
     </w:p>
     <w:p>
@@ -951,30 +927,6 @@
         </w:rPr>
         <w:t xml:space="preserve">Display the StuId, MovieNo, Title, Runtime, Rating code, Rating Short Description, tmdb score </w:t>
       </w:r>
-    </w:p>
-    <w:p>
-      <w:pPr>
-        <w:keepNext w:val="0"/>
-        <w:keepLines w:val="0"/>
-        <w:widowControl/>
-        <w:numPr>
-          <w:ilvl w:val="0"/>
-          <w:numId w:val="3"/>
-        </w:numPr>
-        <w:suppressLineNumbers w:val="0"/>
-        <w:tabs>
-          <w:tab w:val="clear" w:pos="420"/>
-        </w:tabs>
-        <w:ind w:left="880" w:leftChars="0" w:hanging="420" w:firstLineChars="0"/>
-        <w:jc w:val="both"/>
-        <w:rPr>
-          <w:rFonts w:hint="default" w:ascii="Times New Roman" w:hAnsi="Times New Roman" w:cs="Times New Roman"/>
-          <w:b w:val="0"/>
-          <w:bCs w:val="0"/>
-          <w:sz w:val="22"/>
-          <w:szCs w:val="22"/>
-        </w:rPr>
-      </w:pPr>
       <w:r>
         <w:rPr>
           <w:rFonts w:hint="default" w:ascii="Times New Roman" w:hAnsi="Times New Roman" w:eastAsia="SimSun" w:cs="Times New Roman"/>
@@ -1510,18 +1462,6 @@
           <w:lang w:val="en-US"/>
         </w:rPr>
         <w:br w:type="textWrapping"/>
-      </w:r>
-      <w:r>
-        <w:rPr>
-          <w:rFonts w:hint="default" w:ascii="Times New Roman" w:hAnsi="Times New Roman" w:eastAsia="SimSun" w:cs="Times New Roman"/>
-          <w:b/>
-          <w:bCs/>
-          <w:i/>
-          <w:iCs/>
-          <w:sz w:val="21"/>
-          <w:szCs w:val="21"/>
-          <w:lang w:val="en-US"/>
-        </w:rPr>
         <w:t xml:space="preserve">Figure 4: </w:t>
       </w:r>
       <w:r>
@@ -1994,259 +1934,38 @@
           <w:szCs w:val="21"/>
         </w:rPr>
         <w:br w:type="textWrapping"/>
-      </w:r>
-      <w:r>
-        <w:rPr>
-          <w:rFonts w:hint="default" w:ascii="Times New Roman" w:hAnsi="Times New Roman" w:eastAsia="SimSun" w:cs="Times New Roman"/>
-          <w:b/>
-          <w:bCs/>
-          <w:i/>
-          <w:iCs/>
-          <w:sz w:val="21"/>
-          <w:szCs w:val="21"/>
-        </w:rPr>
-        <w:br w:type="textWrapping"/>
-      </w:r>
-      <w:r>
-        <w:rPr>
-          <w:rFonts w:hint="default" w:ascii="Times New Roman" w:hAnsi="Times New Roman" w:eastAsia="SimSun" w:cs="Times New Roman"/>
-          <w:b/>
-          <w:bCs/>
-          <w:i/>
-          <w:iCs/>
-          <w:sz w:val="21"/>
-          <w:szCs w:val="21"/>
-        </w:rPr>
-        <w:br w:type="textWrapping"/>
-      </w:r>
-      <w:r>
-        <w:rPr>
-          <w:rFonts w:hint="default" w:ascii="Times New Roman" w:hAnsi="Times New Roman" w:eastAsia="SimSun" w:cs="Times New Roman"/>
-          <w:b/>
-          <w:bCs/>
-          <w:i/>
-          <w:iCs/>
-          <w:sz w:val="21"/>
-          <w:szCs w:val="21"/>
-        </w:rPr>
-        <w:br w:type="textWrapping"/>
-      </w:r>
-      <w:r>
-        <w:rPr>
-          <w:rFonts w:hint="default" w:ascii="Times New Roman" w:hAnsi="Times New Roman" w:eastAsia="SimSun" w:cs="Times New Roman"/>
-          <w:b/>
-          <w:bCs/>
-          <w:i/>
-          <w:iCs/>
-          <w:sz w:val="21"/>
-          <w:szCs w:val="21"/>
-        </w:rPr>
-        <w:br w:type="textWrapping"/>
-      </w:r>
-      <w:r>
-        <w:rPr>
-          <w:rFonts w:hint="default" w:ascii="Times New Roman" w:hAnsi="Times New Roman" w:eastAsia="SimSun" w:cs="Times New Roman"/>
-          <w:b/>
-          <w:bCs/>
-          <w:i/>
-          <w:iCs/>
-          <w:sz w:val="21"/>
-          <w:szCs w:val="21"/>
-        </w:rPr>
-        <w:br w:type="textWrapping"/>
-      </w:r>
-      <w:r>
-        <w:rPr>
-          <w:rFonts w:hint="default" w:ascii="Times New Roman" w:hAnsi="Times New Roman" w:eastAsia="SimSun" w:cs="Times New Roman"/>
-          <w:b/>
-          <w:bCs/>
-          <w:i/>
-          <w:iCs/>
-          <w:sz w:val="21"/>
-          <w:szCs w:val="21"/>
-        </w:rPr>
-        <w:br w:type="textWrapping"/>
-      </w:r>
-      <w:r>
-        <w:rPr>
-          <w:rFonts w:hint="default" w:ascii="Times New Roman" w:hAnsi="Times New Roman" w:eastAsia="SimSun" w:cs="Times New Roman"/>
-          <w:b/>
-          <w:bCs/>
-          <w:i/>
-          <w:iCs/>
-          <w:sz w:val="21"/>
-          <w:szCs w:val="21"/>
-        </w:rPr>
-        <w:br w:type="textWrapping"/>
-      </w:r>
-      <w:r>
-        <w:rPr>
-          <w:rFonts w:hint="default" w:ascii="Times New Roman" w:hAnsi="Times New Roman" w:eastAsia="SimSun" w:cs="Times New Roman"/>
-          <w:b/>
-          <w:bCs/>
-          <w:i/>
-          <w:iCs/>
-          <w:sz w:val="21"/>
-          <w:szCs w:val="21"/>
-        </w:rPr>
-        <w:br w:type="textWrapping"/>
-      </w:r>
-      <w:r>
-        <w:rPr>
-          <w:rFonts w:hint="default" w:ascii="Times New Roman" w:hAnsi="Times New Roman" w:eastAsia="SimSun" w:cs="Times New Roman"/>
-          <w:b/>
-          <w:bCs/>
-          <w:i/>
-          <w:iCs/>
-          <w:sz w:val="21"/>
-          <w:szCs w:val="21"/>
-        </w:rPr>
-        <w:br w:type="textWrapping"/>
-      </w:r>
-      <w:r>
-        <w:rPr>
-          <w:rFonts w:hint="default" w:ascii="Times New Roman" w:hAnsi="Times New Roman" w:eastAsia="SimSun" w:cs="Times New Roman"/>
-          <w:b/>
-          <w:bCs/>
-          <w:i/>
-          <w:iCs/>
-          <w:sz w:val="21"/>
-          <w:szCs w:val="21"/>
-        </w:rPr>
-        <w:br w:type="textWrapping"/>
-      </w:r>
-      <w:r>
-        <w:rPr>
-          <w:rFonts w:hint="default" w:ascii="Times New Roman" w:hAnsi="Times New Roman" w:eastAsia="SimSun" w:cs="Times New Roman"/>
-          <w:b/>
-          <w:bCs/>
-          <w:i/>
-          <w:iCs/>
-          <w:sz w:val="21"/>
-          <w:szCs w:val="21"/>
-        </w:rPr>
-        <w:br w:type="textWrapping"/>
-      </w:r>
-      <w:r>
-        <w:rPr>
-          <w:rFonts w:hint="default" w:ascii="Times New Roman" w:hAnsi="Times New Roman" w:eastAsia="SimSun" w:cs="Times New Roman"/>
-          <w:b/>
-          <w:bCs/>
-          <w:i/>
-          <w:iCs/>
-          <w:sz w:val="21"/>
-          <w:szCs w:val="21"/>
-        </w:rPr>
-        <w:br w:type="textWrapping"/>
-      </w:r>
-      <w:r>
-        <w:rPr>
-          <w:rFonts w:hint="default" w:ascii="Times New Roman" w:hAnsi="Times New Roman" w:eastAsia="SimSun" w:cs="Times New Roman"/>
-          <w:b/>
-          <w:bCs/>
-          <w:i/>
-          <w:iCs/>
-          <w:sz w:val="21"/>
-          <w:szCs w:val="21"/>
-        </w:rPr>
-        <w:br w:type="textWrapping"/>
-      </w:r>
-      <w:r>
-        <w:rPr>
-          <w:rFonts w:hint="default" w:ascii="Times New Roman" w:hAnsi="Times New Roman" w:eastAsia="SimSun" w:cs="Times New Roman"/>
-          <w:b/>
-          <w:bCs/>
-          <w:i/>
-          <w:iCs/>
-          <w:sz w:val="21"/>
-          <w:szCs w:val="21"/>
-        </w:rPr>
-        <w:br w:type="textWrapping"/>
-      </w:r>
-      <w:r>
-        <w:rPr>
-          <w:rFonts w:hint="default" w:ascii="Times New Roman" w:hAnsi="Times New Roman" w:eastAsia="SimSun" w:cs="Times New Roman"/>
-          <w:b/>
-          <w:bCs/>
-          <w:i/>
-          <w:iCs/>
-          <w:sz w:val="21"/>
-          <w:szCs w:val="21"/>
-        </w:rPr>
-        <w:br w:type="textWrapping"/>
-      </w:r>
-      <w:r>
-        <w:rPr>
-          <w:rFonts w:hint="default" w:ascii="Times New Roman" w:hAnsi="Times New Roman" w:eastAsia="SimSun" w:cs="Times New Roman"/>
-          <w:b/>
-          <w:bCs/>
-          <w:i/>
-          <w:iCs/>
-          <w:sz w:val="21"/>
-          <w:szCs w:val="21"/>
-        </w:rPr>
-        <w:br w:type="textWrapping"/>
-      </w:r>
-      <w:r>
-        <w:rPr>
-          <w:rFonts w:hint="default" w:ascii="Times New Roman" w:hAnsi="Times New Roman" w:eastAsia="SimSun" w:cs="Times New Roman"/>
-          <w:b/>
-          <w:bCs/>
-          <w:i/>
-          <w:iCs/>
-          <w:sz w:val="21"/>
-          <w:szCs w:val="21"/>
-        </w:rPr>
-        <w:br w:type="textWrapping"/>
-      </w:r>
-      <w:r>
-        <w:rPr>
-          <w:rFonts w:hint="default" w:ascii="Times New Roman" w:hAnsi="Times New Roman" w:eastAsia="SimSun" w:cs="Times New Roman"/>
-          <w:b/>
-          <w:bCs/>
-          <w:i/>
-          <w:iCs/>
-          <w:sz w:val="21"/>
-          <w:szCs w:val="21"/>
-        </w:rPr>
-        <w:br w:type="textWrapping"/>
-      </w:r>
-      <w:r>
-        <w:rPr>
-          <w:rFonts w:hint="default" w:ascii="Times New Roman" w:hAnsi="Times New Roman" w:eastAsia="SimSun" w:cs="Times New Roman"/>
-          <w:b/>
-          <w:bCs/>
-          <w:i/>
-          <w:iCs/>
-          <w:sz w:val="21"/>
-          <w:szCs w:val="21"/>
-        </w:rPr>
-        <w:br w:type="textWrapping"/>
-      </w:r>
-      <w:r>
-        <w:rPr>
-          <w:rFonts w:hint="default" w:ascii="Times New Roman" w:hAnsi="Times New Roman" w:eastAsia="SimSun" w:cs="Times New Roman"/>
-          <w:b/>
-          <w:bCs/>
-          <w:i/>
-          <w:iCs/>
-          <w:sz w:val="21"/>
-          <w:szCs w:val="21"/>
-          <w:lang w:val="en-US"/>
-        </w:rPr>
-        <w:br w:type="textWrapping"/>
-      </w:r>
-      <w:r>
-        <w:rPr>
-          <w:rFonts w:hint="default" w:ascii="Times New Roman" w:hAnsi="Times New Roman" w:eastAsia="SimSun" w:cs="Times New Roman"/>
-          <w:b/>
-          <w:bCs/>
-          <w:i/>
-          <w:iCs/>
-          <w:sz w:val="21"/>
-          <w:szCs w:val="21"/>
-          <w:lang w:val="en-US"/>
-        </w:rPr>
+        <w:br w:type="textWrapping"/>
+        <w:br w:type="textWrapping"/>
+        <w:br w:type="textWrapping"/>
+        <w:br w:type="textWrapping"/>
+        <w:br w:type="textWrapping"/>
+        <w:br w:type="textWrapping"/>
+        <w:br w:type="textWrapping"/>
+        <w:br w:type="textWrapping"/>
+        <w:br w:type="textWrapping"/>
+        <w:br w:type="textWrapping"/>
+        <w:br w:type="textWrapping"/>
+        <w:br w:type="textWrapping"/>
+        <w:br w:type="textWrapping"/>
+        <w:br w:type="textWrapping"/>
+        <w:br w:type="textWrapping"/>
+        <w:br w:type="textWrapping"/>
+        <w:br w:type="textWrapping"/>
+        <w:br w:type="textWrapping"/>
+        <w:br w:type="textWrapping"/>
+      </w:r>
+      <w:r>
+        <w:rPr>
+          <w:rFonts w:hint="default" w:ascii="Times New Roman" w:hAnsi="Times New Roman" w:eastAsia="SimSun" w:cs="Times New Roman"/>
+          <w:b/>
+          <w:bCs/>
+          <w:i/>
+          <w:iCs/>
+          <w:sz w:val="21"/>
+          <w:szCs w:val="21"/>
+          <w:lang w:val="en-US"/>
+        </w:rPr>
+        <w:br w:type="textWrapping"/>
         <w:t xml:space="preserve">Figure 6: </w:t>
       </w:r>
       <w:r>
@@ -2387,7 +2106,7 @@
           <w:sz w:val="22"/>
           <w:szCs w:val="22"/>
         </w:rPr>
-        <w:t>In the final task of the Credit section, the laboratory requires updating specific movie records based on runtime and rating conditions, verifying the changes, and displaying the filtered datasets according to defined sorting criteria</w:t>
+        <w:t xml:space="preserve">In the fourth task of the Credit section, the laboratory requires updating specific movie records based on runtime and rating conditions, verifying the changes, and displaying the filtered datasets according to defined sorting criteria</w:t>
       </w:r>
       <w:r>
         <w:rPr>
@@ -2425,137 +2144,16 @@
           <w:szCs w:val="21"/>
         </w:rPr>
         <w:br w:type="textWrapping"/>
-      </w:r>
-      <w:r>
-        <w:rPr>
-          <w:rFonts w:hint="default" w:ascii="Times New Roman" w:hAnsi="Times New Roman" w:eastAsia="SimSun" w:cs="Times New Roman"/>
-          <w:b/>
-          <w:bCs/>
-          <w:i/>
-          <w:iCs/>
-          <w:sz w:val="21"/>
-          <w:szCs w:val="21"/>
-        </w:rPr>
-        <w:br w:type="textWrapping"/>
-      </w:r>
-      <w:r>
-        <w:rPr>
-          <w:rFonts w:hint="default" w:ascii="Times New Roman" w:hAnsi="Times New Roman" w:eastAsia="SimSun" w:cs="Times New Roman"/>
-          <w:b/>
-          <w:bCs/>
-          <w:i/>
-          <w:iCs/>
-          <w:sz w:val="21"/>
-          <w:szCs w:val="21"/>
-        </w:rPr>
-        <w:br w:type="textWrapping"/>
-      </w:r>
-      <w:r>
-        <w:rPr>
-          <w:rFonts w:hint="default" w:ascii="Times New Roman" w:hAnsi="Times New Roman" w:eastAsia="SimSun" w:cs="Times New Roman"/>
-          <w:b/>
-          <w:bCs/>
-          <w:i/>
-          <w:iCs/>
-          <w:sz w:val="21"/>
-          <w:szCs w:val="21"/>
-        </w:rPr>
-        <w:br w:type="textWrapping"/>
-      </w:r>
-      <w:r>
-        <w:rPr>
-          <w:rFonts w:hint="default" w:ascii="Times New Roman" w:hAnsi="Times New Roman" w:eastAsia="SimSun" w:cs="Times New Roman"/>
-          <w:b/>
-          <w:bCs/>
-          <w:i/>
-          <w:iCs/>
-          <w:sz w:val="21"/>
-          <w:szCs w:val="21"/>
-        </w:rPr>
-        <w:br w:type="textWrapping"/>
-      </w:r>
-      <w:r>
-        <w:rPr>
-          <w:rFonts w:hint="default" w:ascii="Times New Roman" w:hAnsi="Times New Roman" w:eastAsia="SimSun" w:cs="Times New Roman"/>
-          <w:b/>
-          <w:bCs/>
-          <w:i/>
-          <w:iCs/>
-          <w:sz w:val="21"/>
-          <w:szCs w:val="21"/>
-        </w:rPr>
-        <w:br w:type="textWrapping"/>
-      </w:r>
-      <w:r>
-        <w:rPr>
-          <w:rFonts w:hint="default" w:ascii="Times New Roman" w:hAnsi="Times New Roman" w:eastAsia="SimSun" w:cs="Times New Roman"/>
-          <w:b/>
-          <w:bCs/>
-          <w:i/>
-          <w:iCs/>
-          <w:sz w:val="21"/>
-          <w:szCs w:val="21"/>
-        </w:rPr>
-        <w:br w:type="textWrapping"/>
-      </w:r>
-      <w:r>
-        <w:rPr>
-          <w:rFonts w:hint="default" w:ascii="Times New Roman" w:hAnsi="Times New Roman" w:eastAsia="SimSun" w:cs="Times New Roman"/>
-          <w:b/>
-          <w:bCs/>
-          <w:i/>
-          <w:iCs/>
-          <w:sz w:val="21"/>
-          <w:szCs w:val="21"/>
-        </w:rPr>
-        <w:br w:type="textWrapping"/>
-      </w:r>
-      <w:r>
-        <w:rPr>
-          <w:rFonts w:hint="default" w:ascii="Times New Roman" w:hAnsi="Times New Roman" w:eastAsia="SimSun" w:cs="Times New Roman"/>
-          <w:b/>
-          <w:bCs/>
-          <w:i/>
-          <w:iCs/>
-          <w:sz w:val="21"/>
-          <w:szCs w:val="21"/>
-        </w:rPr>
-        <w:br w:type="textWrapping"/>
-      </w:r>
-      <w:r>
-        <w:rPr>
-          <w:rFonts w:hint="default" w:ascii="Times New Roman" w:hAnsi="Times New Roman" w:eastAsia="SimSun" w:cs="Times New Roman"/>
-          <w:b/>
-          <w:bCs/>
-          <w:i/>
-          <w:iCs/>
-          <w:sz w:val="21"/>
-          <w:szCs w:val="21"/>
-        </w:rPr>
-        <w:br w:type="textWrapping"/>
-      </w:r>
-      <w:r>
-        <w:rPr>
-          <w:rFonts w:hint="default" w:ascii="Times New Roman" w:hAnsi="Times New Roman" w:eastAsia="SimSun" w:cs="Times New Roman"/>
-          <w:b/>
-          <w:bCs/>
-          <w:i/>
-          <w:iCs/>
-          <w:sz w:val="21"/>
-          <w:szCs w:val="21"/>
-        </w:rPr>
-        <w:br w:type="textWrapping"/>
-      </w:r>
-      <w:r>
-        <w:rPr>
-          <w:rFonts w:hint="default" w:ascii="Times New Roman" w:hAnsi="Times New Roman" w:eastAsia="SimSun" w:cs="Times New Roman"/>
-          <w:b/>
-          <w:bCs/>
-          <w:i/>
-          <w:iCs/>
-          <w:sz w:val="21"/>
-          <w:szCs w:val="21"/>
-        </w:rPr>
+        <w:br w:type="textWrapping"/>
+        <w:br w:type="textWrapping"/>
+        <w:br w:type="textWrapping"/>
+        <w:br w:type="textWrapping"/>
+        <w:br w:type="textWrapping"/>
+        <w:br w:type="textWrapping"/>
+        <w:br w:type="textWrapping"/>
+        <w:br w:type="textWrapping"/>
+        <w:br w:type="textWrapping"/>
+        <w:br w:type="textWrapping"/>
         <w:br w:type="textWrapping"/>
       </w:r>
       <w:r>
@@ -2804,77 +2402,11 @@
           <w:szCs w:val="21"/>
         </w:rPr>
         <w:br w:type="textWrapping"/>
-      </w:r>
-      <w:r>
-        <w:rPr>
-          <w:rFonts w:hint="default" w:ascii="Times New Roman" w:hAnsi="Times New Roman" w:eastAsia="SimSun" w:cs="Times New Roman"/>
-          <w:b/>
-          <w:bCs/>
-          <w:i/>
-          <w:iCs/>
-          <w:sz w:val="21"/>
-          <w:szCs w:val="21"/>
-        </w:rPr>
-        <w:br w:type="textWrapping"/>
-      </w:r>
-      <w:r>
-        <w:rPr>
-          <w:rFonts w:hint="default" w:ascii="Times New Roman" w:hAnsi="Times New Roman" w:eastAsia="SimSun" w:cs="Times New Roman"/>
-          <w:b/>
-          <w:bCs/>
-          <w:i/>
-          <w:iCs/>
-          <w:sz w:val="21"/>
-          <w:szCs w:val="21"/>
-        </w:rPr>
-        <w:br w:type="textWrapping"/>
-      </w:r>
-      <w:r>
-        <w:rPr>
-          <w:rFonts w:hint="default" w:ascii="Times New Roman" w:hAnsi="Times New Roman" w:eastAsia="SimSun" w:cs="Times New Roman"/>
-          <w:b/>
-          <w:bCs/>
-          <w:i/>
-          <w:iCs/>
-          <w:sz w:val="21"/>
-          <w:szCs w:val="21"/>
-        </w:rPr>
-        <w:br w:type="textWrapping"/>
-      </w:r>
-      <w:r>
-        <w:rPr>
-          <w:rFonts w:hint="default" w:ascii="Times New Roman" w:hAnsi="Times New Roman" w:eastAsia="SimSun" w:cs="Times New Roman"/>
-          <w:b/>
-          <w:bCs/>
-          <w:i/>
-          <w:iCs/>
-          <w:sz w:val="21"/>
-          <w:szCs w:val="21"/>
-        </w:rPr>
-        <w:br w:type="textWrapping"/>
-      </w:r>
-      <w:r>
-        <w:rPr>
-          <w:rFonts w:hint="default" w:ascii="Times New Roman" w:hAnsi="Times New Roman" w:eastAsia="SimSun" w:cs="Times New Roman"/>
-          <w:b/>
-          <w:bCs/>
-          <w:i/>
-          <w:iCs/>
-          <w:sz w:val="21"/>
-          <w:szCs w:val="21"/>
-        </w:rPr>
-        <w:br w:type="textWrapping"/>
-      </w:r>
-      <w:r>
-        <w:rPr>
-          <w:rFonts w:hint="default" w:ascii="Times New Roman" w:hAnsi="Times New Roman" w:eastAsia="SimSun" w:cs="Times New Roman"/>
-          <w:b/>
-          <w:bCs/>
-          <w:i/>
-          <w:iCs/>
-          <w:sz w:val="21"/>
-          <w:szCs w:val="21"/>
-        </w:rPr>
+        <w:br w:type="textWrapping"/>
+        <w:br w:type="textWrapping"/>
+        <w:br w:type="textWrapping"/>
+        <w:br w:type="textWrapping"/>
+        <w:br w:type="textWrapping"/>
         <w:br w:type="textWrapping"/>
       </w:r>
       <w:r>
@@ -2926,17 +2458,6 @@
           <w:szCs w:val="21"/>
         </w:rPr>
         <w:br w:type="textWrapping"/>
-      </w:r>
-      <w:r>
-        <w:rPr>
-          <w:rFonts w:hint="default" w:ascii="Times New Roman" w:hAnsi="Times New Roman" w:eastAsia="SimSun" w:cs="Times New Roman"/>
-          <w:b/>
-          <w:bCs/>
-          <w:i/>
-          <w:iCs/>
-          <w:sz w:val="21"/>
-          <w:szCs w:val="21"/>
-        </w:rPr>
         <w:br w:type="textWrapping"/>
       </w:r>
       <w:r>
@@ -3004,161 +2525,18 @@
           <w:szCs w:val="21"/>
         </w:rPr>
         <w:br w:type="textWrapping"/>
-      </w:r>
-      <w:r>
-        <w:rPr>
-          <w:rFonts w:hint="default" w:ascii="Times New Roman" w:hAnsi="Times New Roman" w:eastAsia="SimSun" w:cs="Times New Roman"/>
-          <w:b/>
-          <w:bCs/>
-          <w:i/>
-          <w:iCs/>
-          <w:sz w:val="21"/>
-          <w:szCs w:val="21"/>
-        </w:rPr>
-        <w:br w:type="textWrapping"/>
-      </w:r>
-      <w:r>
-        <w:rPr>
-          <w:rFonts w:hint="default" w:ascii="Times New Roman" w:hAnsi="Times New Roman" w:eastAsia="SimSun" w:cs="Times New Roman"/>
-          <w:b/>
-          <w:bCs/>
-          <w:i/>
-          <w:iCs/>
-          <w:sz w:val="21"/>
-          <w:szCs w:val="21"/>
-        </w:rPr>
-        <w:br w:type="textWrapping"/>
-      </w:r>
-      <w:r>
-        <w:rPr>
-          <w:rFonts w:hint="default" w:ascii="Times New Roman" w:hAnsi="Times New Roman" w:eastAsia="SimSun" w:cs="Times New Roman"/>
-          <w:b/>
-          <w:bCs/>
-          <w:i/>
-          <w:iCs/>
-          <w:sz w:val="21"/>
-          <w:szCs w:val="21"/>
-        </w:rPr>
-        <w:br w:type="textWrapping"/>
-      </w:r>
-      <w:r>
-        <w:rPr>
-          <w:rFonts w:hint="default" w:ascii="Times New Roman" w:hAnsi="Times New Roman" w:eastAsia="SimSun" w:cs="Times New Roman"/>
-          <w:b/>
-          <w:bCs/>
-          <w:i/>
-          <w:iCs/>
-          <w:sz w:val="21"/>
-          <w:szCs w:val="21"/>
-        </w:rPr>
-        <w:br w:type="textWrapping"/>
-      </w:r>
-      <w:r>
-        <w:rPr>
-          <w:rFonts w:hint="default" w:ascii="Times New Roman" w:hAnsi="Times New Roman" w:eastAsia="SimSun" w:cs="Times New Roman"/>
-          <w:b/>
-          <w:bCs/>
-          <w:i/>
-          <w:iCs/>
-          <w:sz w:val="21"/>
-          <w:szCs w:val="21"/>
-        </w:rPr>
-        <w:br w:type="textWrapping"/>
-      </w:r>
-      <w:r>
-        <w:rPr>
-          <w:rFonts w:hint="default" w:ascii="Times New Roman" w:hAnsi="Times New Roman" w:eastAsia="SimSun" w:cs="Times New Roman"/>
-          <w:b/>
-          <w:bCs/>
-          <w:i/>
-          <w:iCs/>
-          <w:sz w:val="21"/>
-          <w:szCs w:val="21"/>
-        </w:rPr>
-        <w:br w:type="textWrapping"/>
-      </w:r>
-      <w:r>
-        <w:rPr>
-          <w:rFonts w:hint="default" w:ascii="Times New Roman" w:hAnsi="Times New Roman" w:eastAsia="SimSun" w:cs="Times New Roman"/>
-          <w:b/>
-          <w:bCs/>
-          <w:i/>
-          <w:iCs/>
-          <w:sz w:val="21"/>
-          <w:szCs w:val="21"/>
-        </w:rPr>
-        <w:br w:type="textWrapping"/>
-      </w:r>
-      <w:r>
-        <w:rPr>
-          <w:rFonts w:hint="default" w:ascii="Times New Roman" w:hAnsi="Times New Roman" w:eastAsia="SimSun" w:cs="Times New Roman"/>
-          <w:b/>
-          <w:bCs/>
-          <w:i/>
-          <w:iCs/>
-          <w:sz w:val="21"/>
-          <w:szCs w:val="21"/>
-        </w:rPr>
-        <w:br w:type="textWrapping"/>
-      </w:r>
-      <w:r>
-        <w:rPr>
-          <w:rFonts w:hint="default" w:ascii="Times New Roman" w:hAnsi="Times New Roman" w:eastAsia="SimSun" w:cs="Times New Roman"/>
-          <w:b/>
-          <w:bCs/>
-          <w:i/>
-          <w:iCs/>
-          <w:sz w:val="21"/>
-          <w:szCs w:val="21"/>
-        </w:rPr>
-        <w:br w:type="textWrapping"/>
-      </w:r>
-      <w:r>
-        <w:rPr>
-          <w:rFonts w:hint="default" w:ascii="Times New Roman" w:hAnsi="Times New Roman" w:eastAsia="SimSun" w:cs="Times New Roman"/>
-          <w:b/>
-          <w:bCs/>
-          <w:i/>
-          <w:iCs/>
-          <w:sz w:val="21"/>
-          <w:szCs w:val="21"/>
-        </w:rPr>
-        <w:br w:type="textWrapping"/>
-      </w:r>
-      <w:r>
-        <w:rPr>
-          <w:rFonts w:hint="default" w:ascii="Times New Roman" w:hAnsi="Times New Roman" w:eastAsia="SimSun" w:cs="Times New Roman"/>
-          <w:b/>
-          <w:bCs/>
-          <w:i/>
-          <w:iCs/>
-          <w:sz w:val="21"/>
-          <w:szCs w:val="21"/>
-        </w:rPr>
-        <w:br w:type="textWrapping"/>
-      </w:r>
-      <w:r>
-        <w:rPr>
-          <w:rFonts w:hint="default" w:ascii="Times New Roman" w:hAnsi="Times New Roman" w:eastAsia="SimSun" w:cs="Times New Roman"/>
-          <w:b/>
-          <w:bCs/>
-          <w:i/>
-          <w:iCs/>
-          <w:sz w:val="21"/>
-          <w:szCs w:val="21"/>
-        </w:rPr>
-        <w:br w:type="textWrapping"/>
-      </w:r>
-      <w:r>
-        <w:rPr>
-          <w:rFonts w:hint="default" w:ascii="Times New Roman" w:hAnsi="Times New Roman" w:eastAsia="SimSun" w:cs="Times New Roman"/>
-          <w:b/>
-          <w:bCs/>
-          <w:i/>
-          <w:iCs/>
-          <w:sz w:val="21"/>
-          <w:szCs w:val="21"/>
-        </w:rPr>
+        <w:br w:type="textWrapping"/>
+        <w:br w:type="textWrapping"/>
+        <w:br w:type="textWrapping"/>
+        <w:br w:type="textWrapping"/>
+        <w:br w:type="textWrapping"/>
+        <w:br w:type="textWrapping"/>
+        <w:br w:type="textWrapping"/>
+        <w:br w:type="textWrapping"/>
+        <w:br w:type="textWrapping"/>
+        <w:br w:type="textWrapping"/>
+        <w:br w:type="textWrapping"/>
+        <w:br w:type="textWrapping"/>
         <w:br w:type="textWrapping"/>
       </w:r>
       <w:r>
@@ -3519,77 +2897,11 @@
           <w:szCs w:val="21"/>
         </w:rPr>
         <w:br w:type="textWrapping"/>
-      </w:r>
-      <w:r>
-        <w:rPr>
-          <w:rFonts w:hint="default" w:ascii="Times New Roman" w:hAnsi="Times New Roman" w:eastAsia="SimSun" w:cs="Times New Roman"/>
-          <w:b/>
-          <w:bCs/>
-          <w:i/>
-          <w:iCs/>
-          <w:sz w:val="21"/>
-          <w:szCs w:val="21"/>
-        </w:rPr>
-        <w:br w:type="textWrapping"/>
-      </w:r>
-      <w:r>
-        <w:rPr>
-          <w:rFonts w:hint="default" w:ascii="Times New Roman" w:hAnsi="Times New Roman" w:eastAsia="SimSun" w:cs="Times New Roman"/>
-          <w:b/>
-          <w:bCs/>
-          <w:i/>
-          <w:iCs/>
-          <w:sz w:val="21"/>
-          <w:szCs w:val="21"/>
-        </w:rPr>
-        <w:br w:type="textWrapping"/>
-      </w:r>
-      <w:r>
-        <w:rPr>
-          <w:rFonts w:hint="default" w:ascii="Times New Roman" w:hAnsi="Times New Roman" w:eastAsia="SimSun" w:cs="Times New Roman"/>
-          <w:b/>
-          <w:bCs/>
-          <w:i/>
-          <w:iCs/>
-          <w:sz w:val="21"/>
-          <w:szCs w:val="21"/>
-        </w:rPr>
-        <w:br w:type="textWrapping"/>
-      </w:r>
-      <w:r>
-        <w:rPr>
-          <w:rFonts w:hint="default" w:ascii="Times New Roman" w:hAnsi="Times New Roman" w:eastAsia="SimSun" w:cs="Times New Roman"/>
-          <w:b/>
-          <w:bCs/>
-          <w:i/>
-          <w:iCs/>
-          <w:sz w:val="21"/>
-          <w:szCs w:val="21"/>
-        </w:rPr>
-        <w:br w:type="textWrapping"/>
-      </w:r>
-      <w:r>
-        <w:rPr>
-          <w:rFonts w:hint="default" w:ascii="Times New Roman" w:hAnsi="Times New Roman" w:eastAsia="SimSun" w:cs="Times New Roman"/>
-          <w:b/>
-          <w:bCs/>
-          <w:i/>
-          <w:iCs/>
-          <w:sz w:val="21"/>
-          <w:szCs w:val="21"/>
-        </w:rPr>
-        <w:br w:type="textWrapping"/>
-      </w:r>
-      <w:r>
-        <w:rPr>
-          <w:rFonts w:hint="default" w:ascii="Times New Roman" w:hAnsi="Times New Roman" w:eastAsia="SimSun" w:cs="Times New Roman"/>
-          <w:b/>
-          <w:bCs/>
-          <w:i/>
-          <w:iCs/>
-          <w:sz w:val="21"/>
-          <w:szCs w:val="21"/>
-        </w:rPr>
+        <w:br w:type="textWrapping"/>
+        <w:br w:type="textWrapping"/>
+        <w:br w:type="textWrapping"/>
+        <w:br w:type="textWrapping"/>
+        <w:br w:type="textWrapping"/>
         <w:br w:type="textWrapping"/>
       </w:r>
     </w:p>
@@ -4062,7 +3374,7 @@
           <w:sz w:val="22"/>
           <w:szCs w:val="22"/>
         </w:rPr>
-        <w:t xml:space="preserve"> based on the relational schema and the following description</w:t>
+        <w:t xml:space="preserve"> based on the relational schema and the ERD below</w:t>
       </w:r>
       <w:r>
         <w:rPr>
@@ -4073,7 +3385,7 @@
           <w:szCs w:val="22"/>
           <w:lang w:val="en-US"/>
         </w:rPr>
-        <w:t xml:space="preserve">. Then, students have to save </w:t>
+        <w:t xml:space="preserve">. Then, students have to save the SQL script</w:t>
       </w:r>
       <w:r>
         <w:rPr>
@@ -4084,7 +3396,7 @@
           <w:szCs w:val="22"/>
           <w:lang w:val="en-US" w:eastAsia="zh-CN" w:bidi="ar"/>
         </w:rPr>
-        <w:t xml:space="preserve">SQL script into a file named </w:t>
+        <w:t xml:space="preserve"> into a file named </w:t>
       </w:r>
       <w:r>
         <w:rPr>
@@ -4110,7 +3422,7 @@
           <w:szCs w:val="22"/>
           <w:lang w:val="en-US" w:eastAsia="zh-CN" w:bidi="ar"/>
         </w:rPr>
-        <w:t>.txt</w:t>
+        <w:t xml:space="preserve">.txt.</w:t>
       </w:r>
     </w:p>
     <w:p>
@@ -4136,126 +3448,16 @@
           <w:lang w:val="en-US"/>
         </w:rPr>
         <w:br w:type="textWrapping"/>
-      </w:r>
-      <w:r>
-        <w:rPr>
-          <w:rFonts w:hint="default" w:ascii="Times New Roman" w:hAnsi="Times New Roman" w:eastAsia="SimSun" w:cs="Times New Roman"/>
-          <w:b w:val="0"/>
-          <w:bCs w:val="0"/>
-          <w:sz w:val="22"/>
-          <w:szCs w:val="22"/>
-          <w:lang w:val="en-US"/>
-        </w:rPr>
-        <w:br w:type="textWrapping"/>
-      </w:r>
-      <w:r>
-        <w:rPr>
-          <w:rFonts w:hint="default" w:ascii="Times New Roman" w:hAnsi="Times New Roman" w:eastAsia="SimSun" w:cs="Times New Roman"/>
-          <w:b w:val="0"/>
-          <w:bCs w:val="0"/>
-          <w:sz w:val="22"/>
-          <w:szCs w:val="22"/>
-          <w:lang w:val="en-US"/>
-        </w:rPr>
-        <w:br w:type="textWrapping"/>
-      </w:r>
-      <w:r>
-        <w:rPr>
-          <w:rFonts w:hint="default" w:ascii="Times New Roman" w:hAnsi="Times New Roman" w:eastAsia="SimSun" w:cs="Times New Roman"/>
-          <w:b w:val="0"/>
-          <w:bCs w:val="0"/>
-          <w:sz w:val="22"/>
-          <w:szCs w:val="22"/>
-          <w:lang w:val="en-US"/>
-        </w:rPr>
-        <w:br w:type="textWrapping"/>
-      </w:r>
-      <w:r>
-        <w:rPr>
-          <w:rFonts w:hint="default" w:ascii="Times New Roman" w:hAnsi="Times New Roman" w:eastAsia="SimSun" w:cs="Times New Roman"/>
-          <w:b w:val="0"/>
-          <w:bCs w:val="0"/>
-          <w:sz w:val="22"/>
-          <w:szCs w:val="22"/>
-          <w:lang w:val="en-US"/>
-        </w:rPr>
-        <w:br w:type="textWrapping"/>
-      </w:r>
-      <w:r>
-        <w:rPr>
-          <w:rFonts w:hint="default" w:ascii="Times New Roman" w:hAnsi="Times New Roman" w:eastAsia="SimSun" w:cs="Times New Roman"/>
-          <w:b w:val="0"/>
-          <w:bCs w:val="0"/>
-          <w:sz w:val="22"/>
-          <w:szCs w:val="22"/>
-          <w:lang w:val="en-US"/>
-        </w:rPr>
-        <w:br w:type="textWrapping"/>
-      </w:r>
-      <w:r>
-        <w:rPr>
-          <w:rFonts w:hint="default" w:ascii="Times New Roman" w:hAnsi="Times New Roman" w:eastAsia="SimSun" w:cs="Times New Roman"/>
-          <w:b w:val="0"/>
-          <w:bCs w:val="0"/>
-          <w:sz w:val="22"/>
-          <w:szCs w:val="22"/>
-          <w:lang w:val="en-US"/>
-        </w:rPr>
-        <w:br w:type="textWrapping"/>
-      </w:r>
-      <w:r>
-        <w:rPr>
-          <w:rFonts w:hint="default" w:ascii="Times New Roman" w:hAnsi="Times New Roman" w:eastAsia="SimSun" w:cs="Times New Roman"/>
-          <w:b w:val="0"/>
-          <w:bCs w:val="0"/>
-          <w:sz w:val="22"/>
-          <w:szCs w:val="22"/>
-          <w:lang w:val="en-US"/>
-        </w:rPr>
-        <w:br w:type="textWrapping"/>
-      </w:r>
-      <w:r>
-        <w:rPr>
-          <w:rFonts w:hint="default" w:ascii="Times New Roman" w:hAnsi="Times New Roman" w:eastAsia="SimSun" w:cs="Times New Roman"/>
-          <w:b w:val="0"/>
-          <w:bCs w:val="0"/>
-          <w:sz w:val="22"/>
-          <w:szCs w:val="22"/>
-          <w:lang w:val="en-US"/>
-        </w:rPr>
-        <w:br w:type="textWrapping"/>
-      </w:r>
-      <w:r>
-        <w:rPr>
-          <w:rFonts w:hint="default" w:ascii="Times New Roman" w:hAnsi="Times New Roman" w:eastAsia="SimSun" w:cs="Times New Roman"/>
-          <w:b w:val="0"/>
-          <w:bCs w:val="0"/>
-          <w:sz w:val="22"/>
-          <w:szCs w:val="22"/>
-          <w:lang w:val="en-US"/>
-        </w:rPr>
-        <w:br w:type="textWrapping"/>
-      </w:r>
-      <w:r>
-        <w:rPr>
-          <w:rFonts w:hint="default" w:ascii="Times New Roman" w:hAnsi="Times New Roman" w:eastAsia="SimSun" w:cs="Times New Roman"/>
-          <w:b w:val="0"/>
-          <w:bCs w:val="0"/>
-          <w:sz w:val="22"/>
-          <w:szCs w:val="22"/>
-          <w:lang w:val="en-US"/>
-        </w:rPr>
-        <w:br w:type="textWrapping"/>
-      </w:r>
-      <w:r>
-        <w:rPr>
-          <w:rFonts w:hint="default" w:ascii="Times New Roman" w:hAnsi="Times New Roman" w:eastAsia="SimSun" w:cs="Times New Roman"/>
-          <w:b w:val="0"/>
-          <w:bCs w:val="0"/>
-          <w:sz w:val="22"/>
-          <w:szCs w:val="22"/>
-          <w:lang w:val="en-US"/>
-        </w:rPr>
+        <w:br w:type="textWrapping"/>
+        <w:br w:type="textWrapping"/>
+        <w:br w:type="textWrapping"/>
+        <w:br w:type="textWrapping"/>
+        <w:br w:type="textWrapping"/>
+        <w:br w:type="textWrapping"/>
+        <w:br w:type="textWrapping"/>
+        <w:br w:type="textWrapping"/>
+        <w:br w:type="textWrapping"/>
+        <w:br w:type="textWrapping"/>
         <w:br w:type="textWrapping"/>
       </w:r>
       <w:r>
@@ -4428,8 +3630,6 @@
             </a:graphic>
           </wp:anchor>
         </w:drawing>
-      </w:r>
-      <w:r>
         <w:drawing>
           <wp:anchor distT="0" distB="0" distL="114300" distR="114300" simplePos="0" relativeHeight="251674624" behindDoc="0" locked="0" layoutInCell="1" allowOverlap="1">
             <wp:simplePos x="0" y="0"/>
@@ -4595,174 +3795,18 @@
           <w:lang w:val="en-US"/>
         </w:rPr>
         <w:br w:type="textWrapping"/>
-      </w:r>
-      <w:r>
-        <w:rPr>
-          <w:rFonts w:hint="default" w:ascii="Times New Roman" w:hAnsi="Times New Roman" w:eastAsia="SimSun" w:cs="Times New Roman"/>
-          <w:b/>
-          <w:bCs/>
-          <w:i/>
-          <w:iCs/>
-          <w:sz w:val="21"/>
-          <w:szCs w:val="21"/>
-          <w:lang w:val="en-US"/>
-        </w:rPr>
-        <w:br w:type="textWrapping"/>
-      </w:r>
-      <w:r>
-        <w:rPr>
-          <w:rFonts w:hint="default" w:ascii="Times New Roman" w:hAnsi="Times New Roman" w:eastAsia="SimSun" w:cs="Times New Roman"/>
-          <w:b/>
-          <w:bCs/>
-          <w:i/>
-          <w:iCs/>
-          <w:sz w:val="21"/>
-          <w:szCs w:val="21"/>
-          <w:lang w:val="en-US"/>
-        </w:rPr>
-        <w:br w:type="textWrapping"/>
-      </w:r>
-      <w:r>
-        <w:rPr>
-          <w:rFonts w:hint="default" w:ascii="Times New Roman" w:hAnsi="Times New Roman" w:eastAsia="SimSun" w:cs="Times New Roman"/>
-          <w:b/>
-          <w:bCs/>
-          <w:i/>
-          <w:iCs/>
-          <w:sz w:val="21"/>
-          <w:szCs w:val="21"/>
-          <w:lang w:val="en-US"/>
-        </w:rPr>
-        <w:br w:type="textWrapping"/>
-      </w:r>
-      <w:r>
-        <w:rPr>
-          <w:rFonts w:hint="default" w:ascii="Times New Roman" w:hAnsi="Times New Roman" w:eastAsia="SimSun" w:cs="Times New Roman"/>
-          <w:b/>
-          <w:bCs/>
-          <w:i/>
-          <w:iCs/>
-          <w:sz w:val="21"/>
-          <w:szCs w:val="21"/>
-          <w:lang w:val="en-US"/>
-        </w:rPr>
-        <w:br w:type="textWrapping"/>
-      </w:r>
-      <w:r>
-        <w:rPr>
-          <w:rFonts w:hint="default" w:ascii="Times New Roman" w:hAnsi="Times New Roman" w:eastAsia="SimSun" w:cs="Times New Roman"/>
-          <w:b/>
-          <w:bCs/>
-          <w:i/>
-          <w:iCs/>
-          <w:sz w:val="21"/>
-          <w:szCs w:val="21"/>
-          <w:lang w:val="en-US"/>
-        </w:rPr>
-        <w:br w:type="textWrapping"/>
-      </w:r>
-      <w:r>
-        <w:rPr>
-          <w:rFonts w:hint="default" w:ascii="Times New Roman" w:hAnsi="Times New Roman" w:eastAsia="SimSun" w:cs="Times New Roman"/>
-          <w:b/>
-          <w:bCs/>
-          <w:i/>
-          <w:iCs/>
-          <w:sz w:val="21"/>
-          <w:szCs w:val="21"/>
-          <w:lang w:val="en-US"/>
-        </w:rPr>
-        <w:br w:type="textWrapping"/>
-      </w:r>
-      <w:r>
-        <w:rPr>
-          <w:rFonts w:hint="default" w:ascii="Times New Roman" w:hAnsi="Times New Roman" w:eastAsia="SimSun" w:cs="Times New Roman"/>
-          <w:b/>
-          <w:bCs/>
-          <w:i/>
-          <w:iCs/>
-          <w:sz w:val="21"/>
-          <w:szCs w:val="21"/>
-          <w:lang w:val="en-US"/>
-        </w:rPr>
-        <w:br w:type="textWrapping"/>
-      </w:r>
-      <w:r>
-        <w:rPr>
-          <w:rFonts w:hint="default" w:ascii="Times New Roman" w:hAnsi="Times New Roman" w:eastAsia="SimSun" w:cs="Times New Roman"/>
-          <w:b/>
-          <w:bCs/>
-          <w:i/>
-          <w:iCs/>
-          <w:sz w:val="21"/>
-          <w:szCs w:val="21"/>
-          <w:lang w:val="en-US"/>
-        </w:rPr>
-        <w:br w:type="textWrapping"/>
-      </w:r>
-      <w:r>
-        <w:rPr>
-          <w:rFonts w:hint="default" w:ascii="Times New Roman" w:hAnsi="Times New Roman" w:eastAsia="SimSun" w:cs="Times New Roman"/>
-          <w:b/>
-          <w:bCs/>
-          <w:i/>
-          <w:iCs/>
-          <w:sz w:val="21"/>
-          <w:szCs w:val="21"/>
-          <w:lang w:val="en-US"/>
-        </w:rPr>
-        <w:br w:type="textWrapping"/>
-      </w:r>
-      <w:r>
-        <w:rPr>
-          <w:rFonts w:hint="default" w:ascii="Times New Roman" w:hAnsi="Times New Roman" w:eastAsia="SimSun" w:cs="Times New Roman"/>
-          <w:b/>
-          <w:bCs/>
-          <w:i/>
-          <w:iCs/>
-          <w:sz w:val="21"/>
-          <w:szCs w:val="21"/>
-          <w:lang w:val="en-US"/>
-        </w:rPr>
-        <w:br w:type="textWrapping"/>
-      </w:r>
-      <w:r>
-        <w:rPr>
-          <w:rFonts w:hint="default" w:ascii="Times New Roman" w:hAnsi="Times New Roman" w:eastAsia="SimSun" w:cs="Times New Roman"/>
-          <w:b/>
-          <w:bCs/>
-          <w:i/>
-          <w:iCs/>
-          <w:sz w:val="21"/>
-          <w:szCs w:val="21"/>
-          <w:lang w:val="en-US"/>
-        </w:rPr>
-        <w:br w:type="textWrapping"/>
-      </w:r>
-      <w:r>
-        <w:rPr>
-          <w:rFonts w:hint="default" w:ascii="Times New Roman" w:hAnsi="Times New Roman" w:eastAsia="SimSun" w:cs="Times New Roman"/>
-          <w:b/>
-          <w:bCs/>
-          <w:i/>
-          <w:iCs/>
-          <w:sz w:val="21"/>
-          <w:szCs w:val="21"/>
-          <w:lang w:val="en-US"/>
-        </w:rPr>
-        <w:br w:type="textWrapping"/>
-      </w:r>
-      <w:r>
-        <w:rPr>
-          <w:rFonts w:hint="default" w:ascii="Times New Roman" w:hAnsi="Times New Roman" w:eastAsia="SimSun" w:cs="Times New Roman"/>
-          <w:b/>
-          <w:bCs/>
-          <w:i/>
-          <w:iCs/>
-          <w:sz w:val="21"/>
-          <w:szCs w:val="21"/>
-          <w:lang w:val="en-US"/>
-        </w:rPr>
+        <w:br w:type="textWrapping"/>
+        <w:br w:type="textWrapping"/>
+        <w:br w:type="textWrapping"/>
+        <w:br w:type="textWrapping"/>
+        <w:br w:type="textWrapping"/>
+        <w:br w:type="textWrapping"/>
+        <w:br w:type="textWrapping"/>
+        <w:br w:type="textWrapping"/>
+        <w:br w:type="textWrapping"/>
+        <w:br w:type="textWrapping"/>
+        <w:br w:type="textWrapping"/>
+        <w:br w:type="textWrapping"/>
         <w:t xml:space="preserve">Figure 17: </w:t>
       </w:r>
       <w:r>
@@ -5023,18 +4067,6 @@
           <w:lang w:val="en-US"/>
         </w:rPr>
         <w:br w:type="textWrapping"/>
-      </w:r>
-      <w:r>
-        <w:rPr>
-          <w:rFonts w:hint="default" w:ascii="Times New Roman" w:hAnsi="Times New Roman" w:eastAsia="SimSun" w:cs="Times New Roman"/>
-          <w:b/>
-          <w:bCs/>
-          <w:i/>
-          <w:iCs/>
-          <w:sz w:val="21"/>
-          <w:szCs w:val="21"/>
-          <w:lang w:val="en-US"/>
-        </w:rPr>
         <w:t xml:space="preserve">Figure 18: </w:t>
       </w:r>
       <w:r>
@@ -5182,7 +4214,7 @@
           <w:szCs w:val="21"/>
           <w:lang w:val="en-US"/>
         </w:rPr>
-        <w:t xml:space="preserve">Figure 19:  </w:t>
+        <w:t xml:space="preserve">Figure 19: </w:t>
       </w:r>
       <w:r>
         <w:rPr>
@@ -5303,7 +4335,7 @@
           <w:sz w:val="22"/>
           <w:szCs w:val="22"/>
         </w:rPr>
-        <w:t>Notably, iSQLJunior doesn’t allow for inserting multiple rows at one time via a single multi-row script execution, so I have to run each</w:t>
+        <w:t xml:space="preserve">Notably, iSQLJunior does not allow multiple rows to be inserted in a single script execution, so each</w:t>
       </w:r>
       <w:r>
         <w:rPr>
@@ -5320,7 +4352,7 @@
           <w:sz w:val="22"/>
           <w:szCs w:val="22"/>
         </w:rPr>
-        <w:t xml:space="preserve"> statement individually to populate the </w:t>
+        <w:t xml:space="preserve"> statement had to be run individually to populate the </w:t>
       </w:r>
       <w:r>
         <w:rPr>
@@ -5351,32 +4383,8 @@
           <w:lang w:val="en-US"/>
         </w:rPr>
         <w:t>.</w:t>
-      </w:r>
-      <w:r>
-        <w:rPr>
-          <w:rFonts w:hint="default" w:ascii="Times New Roman" w:hAnsi="Times New Roman" w:eastAsia="SimSun" w:cs="Times New Roman"/>
-          <w:sz w:val="22"/>
-          <w:szCs w:val="22"/>
-          <w:lang w:val="en-US"/>
-        </w:rPr>
-        <w:br w:type="textWrapping"/>
-      </w:r>
-      <w:r>
-        <w:rPr>
-          <w:rFonts w:hint="default" w:ascii="Times New Roman" w:hAnsi="Times New Roman" w:eastAsia="SimSun" w:cs="Times New Roman"/>
-          <w:sz w:val="22"/>
-          <w:szCs w:val="22"/>
-          <w:lang w:val="en-US"/>
-        </w:rPr>
-        <w:br w:type="textWrapping"/>
-      </w:r>
-      <w:r>
-        <w:rPr>
-          <w:rFonts w:hint="default" w:ascii="Times New Roman" w:hAnsi="Times New Roman" w:eastAsia="SimSun" w:cs="Times New Roman"/>
-          <w:sz w:val="22"/>
-          <w:szCs w:val="22"/>
-          <w:lang w:val="en-US"/>
-        </w:rPr>
+        <w:br w:type="textWrapping"/>
+        <w:br w:type="textWrapping"/>
         <w:br w:type="textWrapping"/>
       </w:r>
       <w:r>
@@ -5622,53 +4630,9 @@
           <w:szCs w:val="21"/>
         </w:rPr>
         <w:br w:type="textWrapping"/>
-      </w:r>
-      <w:r>
-        <w:rPr>
-          <w:rFonts w:hint="default" w:ascii="Times New Roman" w:hAnsi="Times New Roman" w:eastAsia="SimSun" w:cs="Times New Roman"/>
-          <w:b/>
-          <w:bCs/>
-          <w:i/>
-          <w:iCs/>
-          <w:sz w:val="21"/>
-          <w:szCs w:val="21"/>
-        </w:rPr>
-        <w:br w:type="textWrapping"/>
-      </w:r>
-      <w:r>
-        <w:rPr>
-          <w:rFonts w:hint="default" w:ascii="Times New Roman" w:hAnsi="Times New Roman" w:eastAsia="SimSun" w:cs="Times New Roman"/>
-          <w:b/>
-          <w:bCs/>
-          <w:i/>
-          <w:iCs/>
-          <w:sz w:val="21"/>
-          <w:szCs w:val="21"/>
-        </w:rPr>
-        <w:br w:type="textWrapping"/>
-      </w:r>
-      <w:r>
-        <w:rPr>
-          <w:rFonts w:hint="default" w:ascii="Times New Roman" w:hAnsi="Times New Roman" w:eastAsia="SimSun" w:cs="Times New Roman"/>
-          <w:b/>
-          <w:bCs/>
-          <w:i/>
-          <w:iCs/>
-          <w:sz w:val="21"/>
-          <w:szCs w:val="21"/>
-        </w:rPr>
-        <w:br w:type="textWrapping"/>
-      </w:r>
-      <w:r>
-        <w:rPr>
-          <w:rFonts w:hint="default" w:ascii="Times New Roman" w:hAnsi="Times New Roman" w:eastAsia="SimSun" w:cs="Times New Roman"/>
-          <w:b/>
-          <w:bCs/>
-          <w:i/>
-          <w:iCs/>
-          <w:sz w:val="21"/>
-          <w:szCs w:val="21"/>
-        </w:rPr>
+        <w:br w:type="textWrapping"/>
+        <w:br w:type="textWrapping"/>
+        <w:br w:type="textWrapping"/>
         <w:br w:type="textWrapping"/>
       </w:r>
       <w:r>
@@ -5694,7 +4658,7 @@
           <w:sz w:val="21"/>
           <w:szCs w:val="21"/>
         </w:rPr>
-        <w:t>SQL Query to Display All Records Sorted by Primary Key</w:t>
+        <w:t xml:space="preserve">SQL Query Statement to Display All Records Sorted by Primary Key</w:t>
       </w:r>
       <w:r>
         <w:rPr>
@@ -5808,7 +4772,7 @@
           <w:sz w:val="21"/>
           <w:szCs w:val="21"/>
         </w:rPr>
-        <w:t>Query Result for CAR</w:t>
+        <w:t xml:space="preserve">Output Result for CAR</w:t>
       </w:r>
       <w:r>
         <w:rPr>
@@ -6094,122 +5058,14 @@
           <w:lang w:val="en-US"/>
         </w:rPr>
         <w:br w:type="textWrapping"/>
-      </w:r>
-      <w:r>
-        <w:rPr>
-          <w:rFonts w:hint="default" w:ascii="Times New Roman" w:hAnsi="Times New Roman" w:eastAsia="SimSun" w:cs="Times New Roman"/>
-          <w:b/>
-          <w:bCs/>
-          <w:i/>
-          <w:iCs/>
-          <w:sz w:val="21"/>
-          <w:szCs w:val="21"/>
-          <w:lang w:val="en-US"/>
-        </w:rPr>
-        <w:br w:type="textWrapping"/>
-      </w:r>
-      <w:r>
-        <w:rPr>
-          <w:rFonts w:hint="default" w:ascii="Times New Roman" w:hAnsi="Times New Roman" w:eastAsia="SimSun" w:cs="Times New Roman"/>
-          <w:b/>
-          <w:bCs/>
-          <w:i/>
-          <w:iCs/>
-          <w:sz w:val="21"/>
-          <w:szCs w:val="21"/>
-          <w:lang w:val="en-US"/>
-        </w:rPr>
-        <w:br w:type="textWrapping"/>
-      </w:r>
-      <w:r>
-        <w:rPr>
-          <w:rFonts w:hint="default" w:ascii="Times New Roman" w:hAnsi="Times New Roman" w:eastAsia="SimSun" w:cs="Times New Roman"/>
-          <w:b/>
-          <w:bCs/>
-          <w:i/>
-          <w:iCs/>
-          <w:sz w:val="21"/>
-          <w:szCs w:val="21"/>
-          <w:lang w:val="en-US"/>
-        </w:rPr>
-        <w:br w:type="textWrapping"/>
-      </w:r>
-      <w:r>
-        <w:rPr>
-          <w:rFonts w:hint="default" w:ascii="Times New Roman" w:hAnsi="Times New Roman" w:eastAsia="SimSun" w:cs="Times New Roman"/>
-          <w:b/>
-          <w:bCs/>
-          <w:i/>
-          <w:iCs/>
-          <w:sz w:val="21"/>
-          <w:szCs w:val="21"/>
-          <w:lang w:val="en-US"/>
-        </w:rPr>
-        <w:br w:type="textWrapping"/>
-      </w:r>
-      <w:r>
-        <w:rPr>
-          <w:rFonts w:hint="default" w:ascii="Times New Roman" w:hAnsi="Times New Roman" w:eastAsia="SimSun" w:cs="Times New Roman"/>
-          <w:b/>
-          <w:bCs/>
-          <w:i/>
-          <w:iCs/>
-          <w:sz w:val="21"/>
-          <w:szCs w:val="21"/>
-          <w:lang w:val="en-US"/>
-        </w:rPr>
-        <w:br w:type="textWrapping"/>
-      </w:r>
-      <w:r>
-        <w:rPr>
-          <w:rFonts w:hint="default" w:ascii="Times New Roman" w:hAnsi="Times New Roman" w:eastAsia="SimSun" w:cs="Times New Roman"/>
-          <w:b/>
-          <w:bCs/>
-          <w:i/>
-          <w:iCs/>
-          <w:sz w:val="21"/>
-          <w:szCs w:val="21"/>
-          <w:lang w:val="en-US"/>
-        </w:rPr>
-        <w:br w:type="textWrapping"/>
-      </w:r>
-      <w:r>
-        <w:rPr>
-          <w:rFonts w:hint="default" w:ascii="Times New Roman" w:hAnsi="Times New Roman" w:eastAsia="SimSun" w:cs="Times New Roman"/>
-          <w:b/>
-          <w:bCs/>
-          <w:i/>
-          <w:iCs/>
-          <w:sz w:val="21"/>
-          <w:szCs w:val="21"/>
-          <w:lang w:val="en-US"/>
-        </w:rPr>
-        <w:br w:type="textWrapping"/>
-      </w:r>
-      <w:r>
-        <w:rPr>
-          <w:rFonts w:hint="default" w:ascii="Times New Roman" w:hAnsi="Times New Roman" w:eastAsia="SimSun" w:cs="Times New Roman"/>
-          <w:b/>
-          <w:bCs/>
-          <w:i/>
-          <w:iCs/>
-          <w:sz w:val="21"/>
-          <w:szCs w:val="21"/>
-          <w:lang w:val="en-US"/>
-        </w:rPr>
-        <w:br w:type="textWrapping"/>
-      </w:r>
-      <w:r>
-        <w:rPr>
-          <w:rFonts w:hint="default" w:ascii="Times New Roman" w:hAnsi="Times New Roman" w:eastAsia="SimSun" w:cs="Times New Roman"/>
-          <w:b/>
-          <w:bCs/>
-          <w:i/>
-          <w:iCs/>
-          <w:sz w:val="21"/>
-          <w:szCs w:val="21"/>
-          <w:lang w:val="en-US"/>
-        </w:rPr>
+        <w:br w:type="textWrapping"/>
+        <w:br w:type="textWrapping"/>
+        <w:br w:type="textWrapping"/>
+        <w:br w:type="textWrapping"/>
+        <w:br w:type="textWrapping"/>
+        <w:br w:type="textWrapping"/>
+        <w:br w:type="textWrapping"/>
+        <w:br w:type="textWrapping"/>
         <w:t xml:space="preserve">Figure 23: </w:t>
       </w:r>
       <w:r>
@@ -6248,17 +5104,6 @@
           <w:szCs w:val="21"/>
         </w:rPr>
         <w:br w:type="textWrapping"/>
-      </w:r>
-      <w:r>
-        <w:rPr>
-          <w:rFonts w:hint="default" w:ascii="Times New Roman" w:hAnsi="Times New Roman" w:eastAsia="SimSun" w:cs="Times New Roman"/>
-          <w:b/>
-          <w:bCs/>
-          <w:i/>
-          <w:iCs/>
-          <w:sz w:val="21"/>
-          <w:szCs w:val="21"/>
-        </w:rPr>
         <w:br w:type="textWrapping"/>
       </w:r>
       <w:r>
@@ -6379,7 +5224,7 @@
           <w:sz w:val="22"/>
           <w:szCs w:val="22"/>
         </w:rPr>
-        <w:t xml:space="preserve"> table for cars that have a sale date after a specified threshold (</w:t>
+        <w:t xml:space="preserve"> table for cars that have a sale date after a specified date (</w:t>
       </w:r>
       <w:r>
         <w:rPr>
@@ -6416,7 +5261,7 @@
           <w:sz w:val="22"/>
           <w:szCs w:val="22"/>
         </w:rPr>
-        <w:t>) to filter recent transactions accurately.</w:t>
+        <w:t xml:space="preserve">).</w:t>
       </w:r>
     </w:p>
     <w:p>
@@ -6618,7 +5463,7 @@
           <w:szCs w:val="21"/>
           <w:lang w:val="en-US"/>
         </w:rPr>
-        <w:t>Figure 26</w:t>
+        <w:t xml:space="preserve">Figure 26</w:t>
       </w:r>
       <w:bookmarkStart w:id="0" w:name="_GoBack"/>
       <w:bookmarkEnd w:id="0"/>
@@ -6645,7 +5490,7 @@
           <w:sz w:val="21"/>
           <w:szCs w:val="21"/>
         </w:rPr>
-        <w:t>Query Result for Cars with Sale Date After January 01, 2022</w:t>
+        <w:t xml:space="preserve">Output Result for Cars with Sale Date After January 01, 2022</w:t>
       </w:r>
       <w:r>
         <w:rPr>
@@ -6709,7 +5554,7 @@
           <w:sz w:val="22"/>
           <w:szCs w:val="22"/>
         </w:rPr>
-        <w:t xml:space="preserve">In conclusion, this laboratory successfully reinforced relational database management and SQL querying skills using Oracle iSQLJunior. Through practical tasks, the </w:t>
+        <w:t xml:space="preserve">In conclusion, this laboratory successfully reinforced relational database management and SQL querying skills using Oracle iSQLJunior. Through practical tasks, students created, populated, and queried the CAR5520 table</w:t>
       </w:r>
       <w:r>
         <w:rPr>
@@ -6722,15 +5567,15 @@
           <w:sz w:val="22"/>
           <w:szCs w:val="22"/>
         </w:rPr>
-        <w:t>CAR5520</w:t>
-      </w:r>
-      <w:r>
-        <w:rPr>
-          <w:rFonts w:hint="default" w:ascii="Times New Roman" w:hAnsi="Times New Roman" w:eastAsia="SimSun" w:cs="Times New Roman"/>
-          <w:sz w:val="22"/>
-          <w:szCs w:val="22"/>
-        </w:rPr>
-        <w:t xml:space="preserve"> table was structured, populated, and queried using primary key sorting, advanced filtering, pattern matching, and date-based conditions. </w:t>
+        <w:t xml:space="preserve"/>
+      </w:r>
+      <w:r>
+        <w:rPr>
+          <w:rFonts w:hint="default" w:ascii="Times New Roman" w:hAnsi="Times New Roman" w:eastAsia="SimSun" w:cs="Times New Roman"/>
+          <w:sz w:val="22"/>
+          <w:szCs w:val="22"/>
+        </w:rPr>
+        <w:t xml:space="preserve"> using primary key sorting, advanced filtering, pattern matching, and date-based conditions. </w:t>
       </w:r>
       <w:r>
         <w:rPr>

</xml_diff>